<commit_message>
regen: DEM-2026-007 — todos os documentos regenerados com fix de tabelas
Aplica correção de colunas (white-space:nowrap + colgroup) em todos os
14 documentos do projeto DEM-2026-007 (PDF e DOCX).

https://claude.ai/code/session_011eqnYuBMhSuv5NJDarLzxB
</commit_message>
<xml_diff>
--- a/squads/vmo-autonomo/projects/DEM-2026-007/01-qualificacao/demanda-coletada.docx
+++ b/squads/vmo-autonomo/projects/DEM-2026-007/01-qualificacao/demanda-coletada.docx
@@ -8,8 +8,11 @@
       </w:pPr>
       <w:r>
         <w:rPr>
-          <w:color w:val="1F497D"/>
-          <w:sz w:val="36"/>
+          <w:rFonts w:ascii="Calibri" w:hAnsi="Calibri"/>
+          <w:b/>
+          <w:i w:val="0"/>
+          <w:color w:val="1A3A5C"/>
+          <w:sz w:val="30"/>
         </w:rPr>
         <w:t>Demanda Coletada</w:t>
       </w:r>
@@ -31,9 +34,11 @@
     </w:p>
     <w:p/>
     <w:p>
-      <w:r>
-        <w:t>────────────────────────────────────────────────────────────</w:t>
-      </w:r>
+      <w:pPr>
+        <w:pBdr>
+          <w:bottom w:val="single" w:sz="6" w:space="1" w:color="CCCCCC"/>
+        </w:pBdr>
+      </w:pPr>
     </w:p>
     <w:p/>
     <w:p>
@@ -42,8 +47,11 @@
       </w:pPr>
       <w:r>
         <w:rPr>
-          <w:color w:val="2E74B5"/>
-          <w:sz w:val="28"/>
+          <w:rFonts w:ascii="Calibri" w:hAnsi="Calibri"/>
+          <w:b/>
+          <w:i w:val="0"/>
+          <w:color w:val="1E5296"/>
+          <w:sz w:val="25"/>
         </w:rPr>
         <w:t>Fontes Consultadas</w:t>
       </w:r>
@@ -52,27 +60,29 @@
     <w:tbl>
       <w:tblPr>
         <w:tblStyle w:val="TableGrid"/>
-        <w:tblW w:type="auto" w:w="0"/>
         <w:tblLook w:firstColumn="1" w:firstRow="1" w:lastColumn="0" w:lastRow="0" w:noHBand="0" w:noVBand="1" w:val="04A0"/>
+        <w:tblW w:w="8900" w:type="dxa"/>
+        <w:tblLayout w:type="fixed"/>
       </w:tblPr>
       <w:tblGrid>
-        <w:gridCol w:w="1757"/>
-        <w:gridCol w:w="1757"/>
-        <w:gridCol w:w="1757"/>
-        <w:gridCol w:w="1757"/>
-        <w:gridCol w:w="1757"/>
+        <w:gridCol w:w="1020"/>
+        <w:gridCol w:w="1970"/>
+        <w:gridCol w:w="1970"/>
+        <w:gridCol w:w="1970"/>
+        <w:gridCol w:w="1970"/>
       </w:tblGrid>
       <w:tr>
         <w:tc>
           <w:tcPr>
-            <w:tcW w:type="dxa" w:w="1757"/>
-            <w:shd w:val="clear" w:color="auto" w:fill="D6E4F0"/>
+            <w:tcW w:w="1020" w:type="dxa"/>
+            <w:shd w:val="clear" w:color="auto" w:fill="1A3A5C"/>
           </w:tcPr>
           <w:p>
             <w:r>
               <w:rPr>
                 <w:b/>
-                <w:sz w:val="20"/>
+                <w:color w:val="FFFFFF"/>
+                <w:sz w:val="19"/>
               </w:rPr>
               <w:t>#</w:t>
             </w:r>
@@ -80,14 +90,15 @@
         </w:tc>
         <w:tc>
           <w:tcPr>
-            <w:tcW w:type="dxa" w:w="1757"/>
-            <w:shd w:val="clear" w:color="auto" w:fill="D6E4F0"/>
+            <w:tcW w:w="1970" w:type="dxa"/>
+            <w:shd w:val="clear" w:color="auto" w:fill="1A3A5C"/>
           </w:tcPr>
           <w:p>
             <w:r>
               <w:rPr>
                 <w:b/>
-                <w:sz w:val="20"/>
+                <w:color w:val="FFFFFF"/>
+                <w:sz w:val="19"/>
               </w:rPr>
               <w:t>Canal</w:t>
             </w:r>
@@ -95,14 +106,15 @@
         </w:tc>
         <w:tc>
           <w:tcPr>
-            <w:tcW w:type="dxa" w:w="1757"/>
-            <w:shd w:val="clear" w:color="auto" w:fill="D6E4F0"/>
+            <w:tcW w:w="1970" w:type="dxa"/>
+            <w:shd w:val="clear" w:color="auto" w:fill="1A3A5C"/>
           </w:tcPr>
           <w:p>
             <w:r>
               <w:rPr>
                 <w:b/>
-                <w:sz w:val="20"/>
+                <w:color w:val="FFFFFF"/>
+                <w:sz w:val="19"/>
               </w:rPr>
               <w:t>Tipo</w:t>
             </w:r>
@@ -110,14 +122,15 @@
         </w:tc>
         <w:tc>
           <w:tcPr>
-            <w:tcW w:type="dxa" w:w="1757"/>
-            <w:shd w:val="clear" w:color="auto" w:fill="D6E4F0"/>
+            <w:tcW w:w="1970" w:type="dxa"/>
+            <w:shd w:val="clear" w:color="auto" w:fill="1A3A5C"/>
           </w:tcPr>
           <w:p>
             <w:r>
               <w:rPr>
                 <w:b/>
-                <w:sz w:val="20"/>
+                <w:color w:val="FFFFFF"/>
+                <w:sz w:val="19"/>
               </w:rPr>
               <w:t>Descrição</w:t>
             </w:r>
@@ -125,14 +138,15 @@
         </w:tc>
         <w:tc>
           <w:tcPr>
-            <w:tcW w:type="dxa" w:w="1757"/>
-            <w:shd w:val="clear" w:color="auto" w:fill="D6E4F0"/>
+            <w:tcW w:w="1970" w:type="dxa"/>
+            <w:shd w:val="clear" w:color="auto" w:fill="1A3A5C"/>
           </w:tcPr>
           <w:p>
             <w:r>
               <w:rPr>
                 <w:b/>
-                <w:sz w:val="20"/>
+                <w:color w:val="FFFFFF"/>
+                <w:sz w:val="19"/>
               </w:rPr>
               <w:t>Data</w:t>
             </w:r>
@@ -142,12 +156,12 @@
       <w:tr>
         <w:tc>
           <w:tcPr>
-            <w:tcW w:type="dxa" w:w="1757"/>
+            <w:tcW w:w="1020" w:type="dxa"/>
           </w:tcPr>
           <w:p>
             <w:r>
               <w:rPr>
-                <w:sz w:val="20"/>
+                <w:sz w:val="19"/>
               </w:rPr>
               <w:t>1</w:t>
             </w:r>
@@ -155,12 +169,12 @@
         </w:tc>
         <w:tc>
           <w:tcPr>
-            <w:tcW w:type="dxa" w:w="1757"/>
+            <w:tcW w:w="1970" w:type="dxa"/>
           </w:tcPr>
           <w:p>
             <w:r>
               <w:rPr>
-                <w:sz w:val="20"/>
+                <w:sz w:val="19"/>
               </w:rPr>
               <w:t>Ticket Service Desk</w:t>
             </w:r>
@@ -168,12 +182,12 @@
         </w:tc>
         <w:tc>
           <w:tcPr>
-            <w:tcW w:type="dxa" w:w="1757"/>
+            <w:tcW w:w="1970" w:type="dxa"/>
           </w:tcPr>
           <w:p>
             <w:r>
               <w:rPr>
-                <w:sz w:val="20"/>
+                <w:sz w:val="19"/>
               </w:rPr>
               <w:t>PDF</w:t>
             </w:r>
@@ -181,12 +195,12 @@
         </w:tc>
         <w:tc>
           <w:tcPr>
-            <w:tcW w:type="dxa" w:w="1757"/>
+            <w:tcW w:w="1970" w:type="dxa"/>
           </w:tcPr>
           <w:p>
             <w:r>
               <w:rPr>
-                <w:sz w:val="20"/>
+                <w:sz w:val="19"/>
               </w:rPr>
               <w:t>Ticket #6700943 — Sistemas » Sistemática ERP » Solicitação de Novas Demandas/Projetos</w:t>
             </w:r>
@@ -194,12 +208,12 @@
         </w:tc>
         <w:tc>
           <w:tcPr>
-            <w:tcW w:type="dxa" w:w="1757"/>
+            <w:tcW w:w="1970" w:type="dxa"/>
           </w:tcPr>
           <w:p>
             <w:r>
               <w:rPr>
-                <w:sz w:val="20"/>
+                <w:sz w:val="19"/>
               </w:rPr>
               <w:t>07/04/2026</w:t>
             </w:r>
@@ -209,12 +223,13 @@
       <w:tr>
         <w:tc>
           <w:tcPr>
-            <w:tcW w:type="dxa" w:w="1757"/>
+            <w:tcW w:w="1020" w:type="dxa"/>
+            <w:shd w:val="clear" w:color="auto" w:fill="F0F5FB"/>
           </w:tcPr>
           <w:p>
             <w:r>
               <w:rPr>
-                <w:sz w:val="20"/>
+                <w:sz w:val="19"/>
               </w:rPr>
               <w:t>2</w:t>
             </w:r>
@@ -222,12 +237,13 @@
         </w:tc>
         <w:tc>
           <w:tcPr>
-            <w:tcW w:type="dxa" w:w="1757"/>
+            <w:tcW w:w="1970" w:type="dxa"/>
+            <w:shd w:val="clear" w:color="auto" w:fill="F0F5FB"/>
           </w:tcPr>
           <w:p>
             <w:r>
               <w:rPr>
-                <w:sz w:val="20"/>
+                <w:sz w:val="19"/>
               </w:rPr>
               <w:t>E-mail</w:t>
             </w:r>
@@ -235,12 +251,13 @@
         </w:tc>
         <w:tc>
           <w:tcPr>
-            <w:tcW w:type="dxa" w:w="1757"/>
+            <w:tcW w:w="1970" w:type="dxa"/>
+            <w:shd w:val="clear" w:color="auto" w:fill="F0F5FB"/>
           </w:tcPr>
           <w:p>
             <w:r>
               <w:rPr>
-                <w:sz w:val="20"/>
+                <w:sz w:val="19"/>
               </w:rPr>
               <w:t>.msg (cbe638d2)</w:t>
             </w:r>
@@ -248,12 +265,13 @@
         </w:tc>
         <w:tc>
           <w:tcPr>
-            <w:tcW w:type="dxa" w:w="1757"/>
+            <w:tcW w:w="1970" w:type="dxa"/>
+            <w:shd w:val="clear" w:color="auto" w:fill="F0F5FB"/>
           </w:tcPr>
           <w:p>
             <w:r>
               <w:rPr>
-                <w:sz w:val="20"/>
+                <w:sz w:val="19"/>
               </w:rPr>
               <w:t>Thread "RES: REGISTRO DE REQUISIÇÃO SERVICE DESK - 6700943" — Noemia → Walace / Gladston + resposta de Walace</w:t>
             </w:r>
@@ -261,12 +279,13 @@
         </w:tc>
         <w:tc>
           <w:tcPr>
-            <w:tcW w:type="dxa" w:w="1757"/>
+            <w:tcW w:w="1970" w:type="dxa"/>
+            <w:shd w:val="clear" w:color="auto" w:fill="F0F5FB"/>
           </w:tcPr>
           <w:p>
             <w:r>
               <w:rPr>
-                <w:sz w:val="20"/>
+                <w:sz w:val="19"/>
               </w:rPr>
               <w:t>08/04/2026</w:t>
             </w:r>
@@ -276,12 +295,12 @@
       <w:tr>
         <w:tc>
           <w:tcPr>
-            <w:tcW w:type="dxa" w:w="1757"/>
+            <w:tcW w:w="1020" w:type="dxa"/>
           </w:tcPr>
           <w:p>
             <w:r>
               <w:rPr>
-                <w:sz w:val="20"/>
+                <w:sz w:val="19"/>
               </w:rPr>
               <w:t>3</w:t>
             </w:r>
@@ -289,12 +308,12 @@
         </w:tc>
         <w:tc>
           <w:tcPr>
-            <w:tcW w:type="dxa" w:w="1757"/>
+            <w:tcW w:w="1970" w:type="dxa"/>
           </w:tcPr>
           <w:p>
             <w:r>
               <w:rPr>
-                <w:sz w:val="20"/>
+                <w:sz w:val="19"/>
               </w:rPr>
               <w:t>E-mail</w:t>
             </w:r>
@@ -302,12 +321,12 @@
         </w:tc>
         <w:tc>
           <w:tcPr>
-            <w:tcW w:type="dxa" w:w="1757"/>
+            <w:tcW w:w="1970" w:type="dxa"/>
           </w:tcPr>
           <w:p>
             <w:r>
               <w:rPr>
-                <w:sz w:val="20"/>
+                <w:sz w:val="19"/>
               </w:rPr>
               <w:t>.msg (f5809f51)</w:t>
             </w:r>
@@ -315,12 +334,12 @@
         </w:tc>
         <w:tc>
           <w:tcPr>
-            <w:tcW w:type="dxa" w:w="1757"/>
+            <w:tcW w:w="1970" w:type="dxa"/>
           </w:tcPr>
           <w:p>
             <w:r>
               <w:rPr>
-                <w:sz w:val="20"/>
+                <w:sz w:val="19"/>
               </w:rPr>
               <w:t>Thread "Re: REGISTRO DE REQUISIÇÃO SERVICE DESK - 6700943" — Gladston responde a Noemia</w:t>
             </w:r>
@@ -328,12 +347,12 @@
         </w:tc>
         <w:tc>
           <w:tcPr>
-            <w:tcW w:type="dxa" w:w="1757"/>
+            <w:tcW w:w="1970" w:type="dxa"/>
           </w:tcPr>
           <w:p>
             <w:r>
               <w:rPr>
-                <w:sz w:val="20"/>
+                <w:sz w:val="19"/>
               </w:rPr>
               <w:t>06/05/2026</w:t>
             </w:r>
@@ -343,9 +362,11 @@
     </w:tbl>
     <w:p/>
     <w:p>
-      <w:r>
-        <w:t>────────────────────────────────────────────────────────────</w:t>
-      </w:r>
+      <w:pPr>
+        <w:pBdr>
+          <w:bottom w:val="single" w:sz="6" w:space="1" w:color="CCCCCC"/>
+        </w:pBdr>
+      </w:pPr>
     </w:p>
     <w:p/>
     <w:p>
@@ -354,8 +375,11 @@
       </w:pPr>
       <w:r>
         <w:rPr>
-          <w:color w:val="2E74B5"/>
-          <w:sz w:val="28"/>
+          <w:rFonts w:ascii="Calibri" w:hAnsi="Calibri"/>
+          <w:b/>
+          <w:i w:val="0"/>
+          <w:color w:val="1E5296"/>
+          <w:sz w:val="25"/>
         </w:rPr>
         <w:t>Dados da Demanda</w:t>
       </w:r>
@@ -950,26 +974,28 @@
     <w:tbl>
       <w:tblPr>
         <w:tblStyle w:val="TableGrid"/>
-        <w:tblW w:type="auto" w:w="0"/>
         <w:tblLook w:firstColumn="1" w:firstRow="1" w:lastColumn="0" w:lastRow="0" w:noHBand="0" w:noVBand="1" w:val="04A0"/>
+        <w:tblW w:w="8900" w:type="dxa"/>
+        <w:tblLayout w:type="fixed"/>
       </w:tblPr>
       <w:tblGrid>
-        <w:gridCol w:w="2196"/>
-        <w:gridCol w:w="2196"/>
-        <w:gridCol w:w="2196"/>
-        <w:gridCol w:w="2196"/>
+        <w:gridCol w:w="2225"/>
+        <w:gridCol w:w="2225"/>
+        <w:gridCol w:w="2225"/>
+        <w:gridCol w:w="2225"/>
       </w:tblGrid>
       <w:tr>
         <w:tc>
           <w:tcPr>
-            <w:tcW w:type="dxa" w:w="2196"/>
-            <w:shd w:val="clear" w:color="auto" w:fill="D6E4F0"/>
+            <w:tcW w:w="2225" w:type="dxa"/>
+            <w:shd w:val="clear" w:color="auto" w:fill="1A3A5C"/>
           </w:tcPr>
           <w:p>
             <w:r>
               <w:rPr>
                 <w:b/>
-                <w:sz w:val="20"/>
+                <w:color w:val="FFFFFF"/>
+                <w:sz w:val="19"/>
               </w:rPr>
               <w:t>Nome</w:t>
             </w:r>
@@ -977,14 +1003,15 @@
         </w:tc>
         <w:tc>
           <w:tcPr>
-            <w:tcW w:type="dxa" w:w="2196"/>
-            <w:shd w:val="clear" w:color="auto" w:fill="D6E4F0"/>
+            <w:tcW w:w="2225" w:type="dxa"/>
+            <w:shd w:val="clear" w:color="auto" w:fill="1A3A5C"/>
           </w:tcPr>
           <w:p>
             <w:r>
               <w:rPr>
                 <w:b/>
-                <w:sz w:val="20"/>
+                <w:color w:val="FFFFFF"/>
+                <w:sz w:val="19"/>
               </w:rPr>
               <w:t>Papel</w:t>
             </w:r>
@@ -992,14 +1019,15 @@
         </w:tc>
         <w:tc>
           <w:tcPr>
-            <w:tcW w:type="dxa" w:w="2196"/>
-            <w:shd w:val="clear" w:color="auto" w:fill="D6E4F0"/>
+            <w:tcW w:w="2225" w:type="dxa"/>
+            <w:shd w:val="clear" w:color="auto" w:fill="1A3A5C"/>
           </w:tcPr>
           <w:p>
             <w:r>
               <w:rPr>
                 <w:b/>
-                <w:sz w:val="20"/>
+                <w:color w:val="FFFFFF"/>
+                <w:sz w:val="19"/>
               </w:rPr>
               <w:t>Área</w:t>
             </w:r>
@@ -1007,14 +1035,15 @@
         </w:tc>
         <w:tc>
           <w:tcPr>
-            <w:tcW w:type="dxa" w:w="2196"/>
-            <w:shd w:val="clear" w:color="auto" w:fill="D6E4F0"/>
+            <w:tcW w:w="2225" w:type="dxa"/>
+            <w:shd w:val="clear" w:color="auto" w:fill="1A3A5C"/>
           </w:tcPr>
           <w:p>
             <w:r>
               <w:rPr>
                 <w:b/>
-                <w:sz w:val="20"/>
+                <w:color w:val="FFFFFF"/>
+                <w:sz w:val="19"/>
               </w:rPr>
               <w:t>Fonte</w:t>
             </w:r>
@@ -1024,12 +1053,12 @@
       <w:tr>
         <w:tc>
           <w:tcPr>
-            <w:tcW w:type="dxa" w:w="2196"/>
+            <w:tcW w:w="2225" w:type="dxa"/>
           </w:tcPr>
           <w:p>
             <w:r>
               <w:rPr>
-                <w:sz w:val="20"/>
+                <w:sz w:val="19"/>
               </w:rPr>
               <w:t>Lucas Medeiros Pereira</w:t>
             </w:r>
@@ -1037,12 +1066,12 @@
         </w:tc>
         <w:tc>
           <w:tcPr>
-            <w:tcW w:type="dxa" w:w="2196"/>
+            <w:tcW w:w="2225" w:type="dxa"/>
           </w:tcPr>
           <w:p>
             <w:r>
               <w:rPr>
-                <w:sz w:val="20"/>
+                <w:sz w:val="19"/>
               </w:rPr>
               <w:t>Solicitante / Beneficiado</w:t>
             </w:r>
@@ -1050,12 +1079,12 @@
         </w:tc>
         <w:tc>
           <w:tcPr>
-            <w:tcW w:type="dxa" w:w="2196"/>
+            <w:tcW w:w="2225" w:type="dxa"/>
           </w:tcPr>
           <w:p>
             <w:r>
               <w:rPr>
-                <w:sz w:val="20"/>
+                <w:sz w:val="19"/>
               </w:rPr>
               <w:t>VAB Matriz</w:t>
             </w:r>
@@ -1063,12 +1092,12 @@
         </w:tc>
         <w:tc>
           <w:tcPr>
-            <w:tcW w:type="dxa" w:w="2196"/>
+            <w:tcW w:w="2225" w:type="dxa"/>
           </w:tcPr>
           <w:p>
             <w:r>
               <w:rPr>
-                <w:sz w:val="20"/>
+                <w:sz w:val="19"/>
               </w:rPr>
               <w:t>Ticket</w:t>
             </w:r>
@@ -1078,12 +1107,13 @@
       <w:tr>
         <w:tc>
           <w:tcPr>
-            <w:tcW w:type="dxa" w:w="2196"/>
+            <w:tcW w:w="2225" w:type="dxa"/>
+            <w:shd w:val="clear" w:color="auto" w:fill="F0F5FB"/>
           </w:tcPr>
           <w:p>
             <w:r>
               <w:rPr>
-                <w:sz w:val="20"/>
+                <w:sz w:val="19"/>
               </w:rPr>
               <w:t>Noemia Tambara Cardoso Malini</w:t>
             </w:r>
@@ -1091,12 +1121,13 @@
         </w:tc>
         <w:tc>
           <w:tcPr>
-            <w:tcW w:type="dxa" w:w="2196"/>
+            <w:tcW w:w="2225" w:type="dxa"/>
+            <w:shd w:val="clear" w:color="auto" w:fill="F0F5FB"/>
           </w:tcPr>
           <w:p>
             <w:r>
               <w:rPr>
-                <w:sz w:val="20"/>
+                <w:sz w:val="19"/>
               </w:rPr>
               <w:t>Coordenadora do processo; autora dos e-mails</w:t>
             </w:r>
@@ -1104,12 +1135,13 @@
         </w:tc>
         <w:tc>
           <w:tcPr>
-            <w:tcW w:type="dxa" w:w="2196"/>
+            <w:tcW w:w="2225" w:type="dxa"/>
+            <w:shd w:val="clear" w:color="auto" w:fill="F0F5FB"/>
           </w:tcPr>
           <w:p>
             <w:r>
               <w:rPr>
-                <w:sz w:val="20"/>
+                <w:sz w:val="19"/>
               </w:rPr>
               <w:t>VAB Matriz</w:t>
             </w:r>
@@ -1117,12 +1149,13 @@
         </w:tc>
         <w:tc>
           <w:tcPr>
-            <w:tcW w:type="dxa" w:w="2196"/>
+            <w:tcW w:w="2225" w:type="dxa"/>
+            <w:shd w:val="clear" w:color="auto" w:fill="F0F5FB"/>
           </w:tcPr>
           <w:p>
             <w:r>
               <w:rPr>
-                <w:sz w:val="20"/>
+                <w:sz w:val="19"/>
               </w:rPr>
               <w:t>Ticket + E-mails</w:t>
             </w:r>
@@ -1132,12 +1165,12 @@
       <w:tr>
         <w:tc>
           <w:tcPr>
-            <w:tcW w:type="dxa" w:w="2196"/>
+            <w:tcW w:w="2225" w:type="dxa"/>
           </w:tcPr>
           <w:p>
             <w:r>
               <w:rPr>
-                <w:sz w:val="20"/>
+                <w:sz w:val="19"/>
               </w:rPr>
               <w:t>Walace Bacelar da Silva</w:t>
             </w:r>
@@ -1145,12 +1178,12 @@
         </w:tc>
         <w:tc>
           <w:tcPr>
-            <w:tcW w:type="dxa" w:w="2196"/>
+            <w:tcW w:w="2225" w:type="dxa"/>
           </w:tcPr>
           <w:p>
             <w:r>
               <w:rPr>
-                <w:sz w:val="20"/>
+                <w:sz w:val="19"/>
               </w:rPr>
               <w:t>Autorizador Holding (condicional)</w:t>
             </w:r>
@@ -1158,12 +1191,12 @@
         </w:tc>
         <w:tc>
           <w:tcPr>
-            <w:tcW w:type="dxa" w:w="2196"/>
+            <w:tcW w:w="2225" w:type="dxa"/>
           </w:tcPr>
           <w:p>
             <w:r>
               <w:rPr>
-                <w:sz w:val="20"/>
+                <w:sz w:val="19"/>
               </w:rPr>
               <w:t>Holding</w:t>
             </w:r>
@@ -1171,12 +1204,12 @@
         </w:tc>
         <w:tc>
           <w:tcPr>
-            <w:tcW w:type="dxa" w:w="2196"/>
+            <w:tcW w:w="2225" w:type="dxa"/>
           </w:tcPr>
           <w:p>
             <w:r>
               <w:rPr>
-                <w:sz w:val="20"/>
+                <w:sz w:val="19"/>
               </w:rPr>
               <w:t>E-mail Fonte 2</w:t>
             </w:r>
@@ -1186,12 +1219,13 @@
       <w:tr>
         <w:tc>
           <w:tcPr>
-            <w:tcW w:type="dxa" w:w="2196"/>
+            <w:tcW w:w="2225" w:type="dxa"/>
+            <w:shd w:val="clear" w:color="auto" w:fill="F0F5FB"/>
           </w:tcPr>
           <w:p>
             <w:r>
               <w:rPr>
-                <w:sz w:val="20"/>
+                <w:sz w:val="19"/>
               </w:rPr>
               <w:t>Gladston Campos</w:t>
             </w:r>
@@ -1199,12 +1233,13 @@
         </w:tc>
         <w:tc>
           <w:tcPr>
-            <w:tcW w:type="dxa" w:w="2196"/>
+            <w:tcW w:w="2225" w:type="dxa"/>
+            <w:shd w:val="clear" w:color="auto" w:fill="F0F5FB"/>
           </w:tcPr>
           <w:p>
             <w:r>
               <w:rPr>
-                <w:sz w:val="20"/>
+                <w:sz w:val="19"/>
               </w:rPr>
               <w:t>Gerência TI/Projetos — aprovador</w:t>
             </w:r>
@@ -1212,12 +1247,13 @@
         </w:tc>
         <w:tc>
           <w:tcPr>
-            <w:tcW w:type="dxa" w:w="2196"/>
+            <w:tcW w:w="2225" w:type="dxa"/>
+            <w:shd w:val="clear" w:color="auto" w:fill="F0F5FB"/>
           </w:tcPr>
           <w:p>
             <w:r>
               <w:rPr>
-                <w:sz w:val="20"/>
+                <w:sz w:val="19"/>
               </w:rPr>
               <w:t>VAB Matriz</w:t>
             </w:r>
@@ -1225,12 +1261,13 @@
         </w:tc>
         <w:tc>
           <w:tcPr>
-            <w:tcW w:type="dxa" w:w="2196"/>
+            <w:tcW w:w="2225" w:type="dxa"/>
+            <w:shd w:val="clear" w:color="auto" w:fill="F0F5FB"/>
           </w:tcPr>
           <w:p>
             <w:r>
               <w:rPr>
-                <w:sz w:val="20"/>
+                <w:sz w:val="19"/>
               </w:rPr>
               <w:t>E-mail Fonte 3</w:t>
             </w:r>
@@ -1240,12 +1277,12 @@
       <w:tr>
         <w:tc>
           <w:tcPr>
-            <w:tcW w:type="dxa" w:w="2196"/>
+            <w:tcW w:w="2225" w:type="dxa"/>
           </w:tcPr>
           <w:p>
             <w:r>
               <w:rPr>
-                <w:sz w:val="20"/>
+                <w:sz w:val="19"/>
               </w:rPr>
               <w:t>Viviane Cristina Caliari</w:t>
             </w:r>
@@ -1253,12 +1290,12 @@
         </w:tc>
         <w:tc>
           <w:tcPr>
-            <w:tcW w:type="dxa" w:w="2196"/>
+            <w:tcW w:w="2225" w:type="dxa"/>
           </w:tcPr>
           <w:p>
             <w:r>
               <w:rPr>
-                <w:sz w:val="20"/>
+                <w:sz w:val="19"/>
               </w:rPr>
               <w:t>Copiada no e-mail</w:t>
             </w:r>
@@ -1266,12 +1303,12 @@
         </w:tc>
         <w:tc>
           <w:tcPr>
-            <w:tcW w:type="dxa" w:w="2196"/>
+            <w:tcW w:w="2225" w:type="dxa"/>
           </w:tcPr>
           <w:p>
             <w:r>
               <w:rPr>
-                <w:sz w:val="20"/>
+                <w:sz w:val="19"/>
               </w:rPr>
               <w:t>Holding DTI</w:t>
             </w:r>
@@ -1279,12 +1316,12 @@
         </w:tc>
         <w:tc>
           <w:tcPr>
-            <w:tcW w:type="dxa" w:w="2196"/>
+            <w:tcW w:w="2225" w:type="dxa"/>
           </w:tcPr>
           <w:p>
             <w:r>
               <w:rPr>
-                <w:sz w:val="20"/>
+                <w:sz w:val="19"/>
               </w:rPr>
               <w:t>E-mail Fonte 2</w:t>
             </w:r>
@@ -1294,12 +1331,13 @@
       <w:tr>
         <w:tc>
           <w:tcPr>
-            <w:tcW w:type="dxa" w:w="2196"/>
+            <w:tcW w:w="2225" w:type="dxa"/>
+            <w:shd w:val="clear" w:color="auto" w:fill="F0F5FB"/>
           </w:tcPr>
           <w:p>
             <w:r>
               <w:rPr>
-                <w:sz w:val="20"/>
+                <w:sz w:val="19"/>
               </w:rPr>
               <w:t>Henrique Demoner De Lima</w:t>
             </w:r>
@@ -1307,12 +1345,13 @@
         </w:tc>
         <w:tc>
           <w:tcPr>
-            <w:tcW w:type="dxa" w:w="2196"/>
+            <w:tcW w:w="2225" w:type="dxa"/>
+            <w:shd w:val="clear" w:color="auto" w:fill="F0F5FB"/>
           </w:tcPr>
           <w:p>
             <w:r>
               <w:rPr>
-                <w:sz w:val="20"/>
+                <w:sz w:val="19"/>
               </w:rPr>
               <w:t>Copiado no e-mail</w:t>
             </w:r>
@@ -1320,12 +1359,13 @@
         </w:tc>
         <w:tc>
           <w:tcPr>
-            <w:tcW w:type="dxa" w:w="2196"/>
+            <w:tcW w:w="2225" w:type="dxa"/>
+            <w:shd w:val="clear" w:color="auto" w:fill="F0F5FB"/>
           </w:tcPr>
           <w:p>
             <w:r>
               <w:rPr>
-                <w:sz w:val="20"/>
+                <w:sz w:val="19"/>
               </w:rPr>
               <w:t>VAB Matriz</w:t>
             </w:r>
@@ -1333,12 +1373,13 @@
         </w:tc>
         <w:tc>
           <w:tcPr>
-            <w:tcW w:type="dxa" w:w="2196"/>
+            <w:tcW w:w="2225" w:type="dxa"/>
+            <w:shd w:val="clear" w:color="auto" w:fill="F0F5FB"/>
           </w:tcPr>
           <w:p>
             <w:r>
               <w:rPr>
-                <w:sz w:val="20"/>
+                <w:sz w:val="19"/>
               </w:rPr>
               <w:t>E-mail Fonte 2</w:t>
             </w:r>
@@ -1348,12 +1389,12 @@
       <w:tr>
         <w:tc>
           <w:tcPr>
-            <w:tcW w:type="dxa" w:w="2196"/>
+            <w:tcW w:w="2225" w:type="dxa"/>
           </w:tcPr>
           <w:p>
             <w:r>
               <w:rPr>
-                <w:sz w:val="20"/>
+                <w:sz w:val="19"/>
               </w:rPr>
               <w:t>Hugo Paradella Albertino</w:t>
             </w:r>
@@ -1361,12 +1402,12 @@
         </w:tc>
         <w:tc>
           <w:tcPr>
-            <w:tcW w:type="dxa" w:w="2196"/>
+            <w:tcW w:w="2225" w:type="dxa"/>
           </w:tcPr>
           <w:p>
             <w:r>
               <w:rPr>
-                <w:sz w:val="20"/>
+                <w:sz w:val="19"/>
               </w:rPr>
               <w:t>Copiado no e-mail</w:t>
             </w:r>
@@ -1374,12 +1415,12 @@
         </w:tc>
         <w:tc>
           <w:tcPr>
-            <w:tcW w:type="dxa" w:w="2196"/>
+            <w:tcW w:w="2225" w:type="dxa"/>
           </w:tcPr>
           <w:p>
             <w:r>
               <w:rPr>
-                <w:sz w:val="20"/>
+                <w:sz w:val="19"/>
               </w:rPr>
               <w:t>Holding Assessoria</w:t>
             </w:r>
@@ -1387,12 +1428,12 @@
         </w:tc>
         <w:tc>
           <w:tcPr>
-            <w:tcW w:type="dxa" w:w="2196"/>
+            <w:tcW w:w="2225" w:type="dxa"/>
           </w:tcPr>
           <w:p>
             <w:r>
               <w:rPr>
-                <w:sz w:val="20"/>
+                <w:sz w:val="19"/>
               </w:rPr>
               <w:t>E-mail Fonte 2</w:t>
             </w:r>
@@ -1402,12 +1443,13 @@
       <w:tr>
         <w:tc>
           <w:tcPr>
-            <w:tcW w:type="dxa" w:w="2196"/>
+            <w:tcW w:w="2225" w:type="dxa"/>
+            <w:shd w:val="clear" w:color="auto" w:fill="F0F5FB"/>
           </w:tcPr>
           <w:p>
             <w:r>
               <w:rPr>
-                <w:sz w:val="20"/>
+                <w:sz w:val="19"/>
               </w:rPr>
               <w:t>Wellington Gonçalves Teodoro da Silva</w:t>
             </w:r>
@@ -1415,12 +1457,13 @@
         </w:tc>
         <w:tc>
           <w:tcPr>
-            <w:tcW w:type="dxa" w:w="2196"/>
+            <w:tcW w:w="2225" w:type="dxa"/>
+            <w:shd w:val="clear" w:color="auto" w:fill="F0F5FB"/>
           </w:tcPr>
           <w:p>
             <w:r>
               <w:rPr>
-                <w:sz w:val="20"/>
+                <w:sz w:val="19"/>
               </w:rPr>
               <w:t>Copiado no e-mail</w:t>
             </w:r>
@@ -1428,12 +1471,13 @@
         </w:tc>
         <w:tc>
           <w:tcPr>
-            <w:tcW w:type="dxa" w:w="2196"/>
+            <w:tcW w:w="2225" w:type="dxa"/>
+            <w:shd w:val="clear" w:color="auto" w:fill="F0F5FB"/>
           </w:tcPr>
           <w:p>
             <w:r>
               <w:rPr>
-                <w:sz w:val="20"/>
+                <w:sz w:val="19"/>
               </w:rPr>
               <w:t>VAB Matriz</w:t>
             </w:r>
@@ -1441,12 +1485,13 @@
         </w:tc>
         <w:tc>
           <w:tcPr>
-            <w:tcW w:type="dxa" w:w="2196"/>
+            <w:tcW w:w="2225" w:type="dxa"/>
+            <w:shd w:val="clear" w:color="auto" w:fill="F0F5FB"/>
           </w:tcPr>
           <w:p>
             <w:r>
               <w:rPr>
-                <w:sz w:val="20"/>
+                <w:sz w:val="19"/>
               </w:rPr>
               <w:t>E-mail Fonte 3</w:t>
             </w:r>
@@ -1456,12 +1501,12 @@
       <w:tr>
         <w:tc>
           <w:tcPr>
-            <w:tcW w:type="dxa" w:w="2196"/>
+            <w:tcW w:w="2225" w:type="dxa"/>
           </w:tcPr>
           <w:p>
             <w:r>
               <w:rPr>
-                <w:sz w:val="20"/>
+                <w:sz w:val="19"/>
               </w:rPr>
               <w:t>Ana Luisa Curcio Magalhaes</w:t>
             </w:r>
@@ -1469,12 +1514,12 @@
         </w:tc>
         <w:tc>
           <w:tcPr>
-            <w:tcW w:type="dxa" w:w="2196"/>
+            <w:tcW w:w="2225" w:type="dxa"/>
           </w:tcPr>
           <w:p>
             <w:r>
               <w:rPr>
-                <w:sz w:val="20"/>
+                <w:sz w:val="19"/>
               </w:rPr>
               <w:t>Copiada no ticket</w:t>
             </w:r>
@@ -1482,12 +1527,12 @@
         </w:tc>
         <w:tc>
           <w:tcPr>
-            <w:tcW w:type="dxa" w:w="2196"/>
+            <w:tcW w:w="2225" w:type="dxa"/>
           </w:tcPr>
           <w:p>
             <w:r>
               <w:rPr>
-                <w:sz w:val="20"/>
+                <w:sz w:val="19"/>
               </w:rPr>
               <w:t>Holding DTI</w:t>
             </w:r>
@@ -1495,12 +1540,12 @@
         </w:tc>
         <w:tc>
           <w:tcPr>
-            <w:tcW w:type="dxa" w:w="2196"/>
+            <w:tcW w:w="2225" w:type="dxa"/>
           </w:tcPr>
           <w:p>
             <w:r>
               <w:rPr>
-                <w:sz w:val="20"/>
+                <w:sz w:val="19"/>
               </w:rPr>
               <w:t>Ticket</w:t>
             </w:r>
@@ -1510,12 +1555,13 @@
       <w:tr>
         <w:tc>
           <w:tcPr>
-            <w:tcW w:type="dxa" w:w="2196"/>
+            <w:tcW w:w="2225" w:type="dxa"/>
+            <w:shd w:val="clear" w:color="auto" w:fill="F0F5FB"/>
           </w:tcPr>
           <w:p>
             <w:r>
               <w:rPr>
-                <w:sz w:val="20"/>
+                <w:sz w:val="19"/>
               </w:rPr>
               <w:t>Cassio Ribeiro Rosa</w:t>
             </w:r>
@@ -1523,12 +1569,13 @@
         </w:tc>
         <w:tc>
           <w:tcPr>
-            <w:tcW w:type="dxa" w:w="2196"/>
+            <w:tcW w:w="2225" w:type="dxa"/>
+            <w:shd w:val="clear" w:color="auto" w:fill="F0F5FB"/>
           </w:tcPr>
           <w:p>
             <w:r>
               <w:rPr>
-                <w:sz w:val="20"/>
+                <w:sz w:val="19"/>
               </w:rPr>
               <w:t>Copiado no ticket</w:t>
             </w:r>
@@ -1536,12 +1583,13 @@
         </w:tc>
         <w:tc>
           <w:tcPr>
-            <w:tcW w:type="dxa" w:w="2196"/>
+            <w:tcW w:w="2225" w:type="dxa"/>
+            <w:shd w:val="clear" w:color="auto" w:fill="F0F5FB"/>
           </w:tcPr>
           <w:p>
             <w:r>
               <w:rPr>
-                <w:sz w:val="20"/>
+                <w:sz w:val="19"/>
               </w:rPr>
               <w:t>Holding DTI</w:t>
             </w:r>
@@ -1549,12 +1597,13 @@
         </w:tc>
         <w:tc>
           <w:tcPr>
-            <w:tcW w:type="dxa" w:w="2196"/>
+            <w:tcW w:w="2225" w:type="dxa"/>
+            <w:shd w:val="clear" w:color="auto" w:fill="F0F5FB"/>
           </w:tcPr>
           <w:p>
             <w:r>
               <w:rPr>
-                <w:sz w:val="20"/>
+                <w:sz w:val="19"/>
               </w:rPr>
               <w:t>Ticket</w:t>
             </w:r>
@@ -1564,12 +1613,12 @@
       <w:tr>
         <w:tc>
           <w:tcPr>
-            <w:tcW w:type="dxa" w:w="2196"/>
+            <w:tcW w:w="2225" w:type="dxa"/>
           </w:tcPr>
           <w:p>
             <w:r>
               <w:rPr>
-                <w:sz w:val="20"/>
+                <w:sz w:val="19"/>
               </w:rPr>
               <w:t>Charles da Vitoria Ribeiro Costa</w:t>
             </w:r>
@@ -1577,12 +1626,12 @@
         </w:tc>
         <w:tc>
           <w:tcPr>
-            <w:tcW w:type="dxa" w:w="2196"/>
+            <w:tcW w:w="2225" w:type="dxa"/>
           </w:tcPr>
           <w:p>
             <w:r>
               <w:rPr>
-                <w:sz w:val="20"/>
+                <w:sz w:val="19"/>
               </w:rPr>
               <w:t>Copiado no ticket</w:t>
             </w:r>
@@ -1590,12 +1639,12 @@
         </w:tc>
         <w:tc>
           <w:tcPr>
-            <w:tcW w:type="dxa" w:w="2196"/>
+            <w:tcW w:w="2225" w:type="dxa"/>
           </w:tcPr>
           <w:p>
             <w:r>
               <w:rPr>
-                <w:sz w:val="20"/>
+                <w:sz w:val="19"/>
               </w:rPr>
               <w:t>Holding DTI</w:t>
             </w:r>
@@ -1603,12 +1652,12 @@
         </w:tc>
         <w:tc>
           <w:tcPr>
-            <w:tcW w:type="dxa" w:w="2196"/>
+            <w:tcW w:w="2225" w:type="dxa"/>
           </w:tcPr>
           <w:p>
             <w:r>
               <w:rPr>
-                <w:sz w:val="20"/>
+                <w:sz w:val="19"/>
               </w:rPr>
               <w:t>Ticket</w:t>
             </w:r>
@@ -1696,9 +1745,11 @@
     </w:p>
     <w:p/>
     <w:p>
-      <w:r>
-        <w:t>────────────────────────────────────────────────────────────</w:t>
-      </w:r>
+      <w:pPr>
+        <w:pBdr>
+          <w:bottom w:val="single" w:sz="6" w:space="1" w:color="CCCCCC"/>
+        </w:pBdr>
+      </w:pPr>
     </w:p>
     <w:p/>
     <w:p>
@@ -1707,8 +1758,11 @@
       </w:pPr>
       <w:r>
         <w:rPr>
-          <w:color w:val="2E74B5"/>
-          <w:sz w:val="28"/>
+          <w:rFonts w:ascii="Calibri" w:hAnsi="Calibri"/>
+          <w:b/>
+          <w:i w:val="0"/>
+          <w:color w:val="1E5296"/>
+          <w:sz w:val="25"/>
         </w:rPr>
         <w:t>Lacunas Identificadas</w:t>
       </w:r>
@@ -1717,26 +1771,28 @@
     <w:tbl>
       <w:tblPr>
         <w:tblStyle w:val="TableGrid"/>
-        <w:tblW w:type="auto" w:w="0"/>
         <w:tblLook w:firstColumn="1" w:firstRow="1" w:lastColumn="0" w:lastRow="0" w:noHBand="0" w:noVBand="1" w:val="04A0"/>
+        <w:tblW w:w="8901" w:type="dxa"/>
+        <w:tblLayout w:type="fixed"/>
       </w:tblPr>
       <w:tblGrid>
-        <w:gridCol w:w="2196"/>
-        <w:gridCol w:w="2196"/>
-        <w:gridCol w:w="2196"/>
-        <w:gridCol w:w="2196"/>
+        <w:gridCol w:w="1020"/>
+        <w:gridCol w:w="2627"/>
+        <w:gridCol w:w="2627"/>
+        <w:gridCol w:w="2627"/>
       </w:tblGrid>
       <w:tr>
         <w:tc>
           <w:tcPr>
-            <w:tcW w:type="dxa" w:w="2196"/>
-            <w:shd w:val="clear" w:color="auto" w:fill="D6E4F0"/>
+            <w:tcW w:w="1020" w:type="dxa"/>
+            <w:shd w:val="clear" w:color="auto" w:fill="1A3A5C"/>
           </w:tcPr>
           <w:p>
             <w:r>
               <w:rPr>
                 <w:b/>
-                <w:sz w:val="20"/>
+                <w:color w:val="FFFFFF"/>
+                <w:sz w:val="19"/>
               </w:rPr>
               <w:t>#</w:t>
             </w:r>
@@ -1744,14 +1800,15 @@
         </w:tc>
         <w:tc>
           <w:tcPr>
-            <w:tcW w:type="dxa" w:w="2196"/>
-            <w:shd w:val="clear" w:color="auto" w:fill="D6E4F0"/>
+            <w:tcW w:w="2627" w:type="dxa"/>
+            <w:shd w:val="clear" w:color="auto" w:fill="1A3A5C"/>
           </w:tcPr>
           <w:p>
             <w:r>
               <w:rPr>
                 <w:b/>
-                <w:sz w:val="20"/>
+                <w:color w:val="FFFFFF"/>
+                <w:sz w:val="19"/>
               </w:rPr>
               <w:t>Campo</w:t>
             </w:r>
@@ -1759,14 +1816,15 @@
         </w:tc>
         <w:tc>
           <w:tcPr>
-            <w:tcW w:type="dxa" w:w="2196"/>
-            <w:shd w:val="clear" w:color="auto" w:fill="D6E4F0"/>
+            <w:tcW w:w="2627" w:type="dxa"/>
+            <w:shd w:val="clear" w:color="auto" w:fill="1A3A5C"/>
           </w:tcPr>
           <w:p>
             <w:r>
               <w:rPr>
                 <w:b/>
-                <w:sz w:val="20"/>
+                <w:color w:val="FFFFFF"/>
+                <w:sz w:val="19"/>
               </w:rPr>
               <w:t>Status</w:t>
             </w:r>
@@ -1774,14 +1832,15 @@
         </w:tc>
         <w:tc>
           <w:tcPr>
-            <w:tcW w:type="dxa" w:w="2196"/>
-            <w:shd w:val="clear" w:color="auto" w:fill="D6E4F0"/>
+            <w:tcW w:w="2627" w:type="dxa"/>
+            <w:shd w:val="clear" w:color="auto" w:fill="1A3A5C"/>
           </w:tcPr>
           <w:p>
             <w:r>
               <w:rPr>
                 <w:b/>
-                <w:sz w:val="20"/>
+                <w:color w:val="FFFFFF"/>
+                <w:sz w:val="19"/>
               </w:rPr>
               <w:t>Pergunta para Esclarecimento</w:t>
             </w:r>
@@ -1791,12 +1850,12 @@
       <w:tr>
         <w:tc>
           <w:tcPr>
-            <w:tcW w:type="dxa" w:w="2196"/>
+            <w:tcW w:w="1020" w:type="dxa"/>
           </w:tcPr>
           <w:p>
             <w:r>
               <w:rPr>
-                <w:sz w:val="20"/>
+                <w:sz w:val="19"/>
               </w:rPr>
               <w:t>L1</w:t>
             </w:r>
@@ -1804,12 +1863,12 @@
         </w:tc>
         <w:tc>
           <w:tcPr>
-            <w:tcW w:type="dxa" w:w="2196"/>
+            <w:tcW w:w="2627" w:type="dxa"/>
           </w:tcPr>
           <w:p>
             <w:r>
               <w:rPr>
-                <w:sz w:val="20"/>
+                <w:sz w:val="19"/>
               </w:rPr>
               <w:t>Prazo desejado</w:t>
             </w:r>
@@ -1817,12 +1876,12 @@
         </w:tc>
         <w:tc>
           <w:tcPr>
-            <w:tcW w:type="dxa" w:w="2196"/>
+            <w:tcW w:w="2627" w:type="dxa"/>
           </w:tcPr>
           <w:p>
             <w:r>
               <w:rPr>
-                <w:sz w:val="20"/>
+                <w:sz w:val="19"/>
               </w:rPr>
               <w:t>NÃO INFORMADO</w:t>
             </w:r>
@@ -1830,12 +1889,12 @@
         </w:tc>
         <w:tc>
           <w:tcPr>
-            <w:tcW w:type="dxa" w:w="2196"/>
+            <w:tcW w:w="2627" w:type="dxa"/>
           </w:tcPr>
           <w:p>
             <w:r>
               <w:rPr>
-                <w:sz w:val="20"/>
+                <w:sz w:val="19"/>
               </w:rPr>
               <w:t>Há alguma data-limite para a entrega? Evento, fechamento contábil, auditoria?</w:t>
             </w:r>
@@ -1845,12 +1904,13 @@
       <w:tr>
         <w:tc>
           <w:tcPr>
-            <w:tcW w:type="dxa" w:w="2196"/>
+            <w:tcW w:w="1020" w:type="dxa"/>
+            <w:shd w:val="clear" w:color="auto" w:fill="F0F5FB"/>
           </w:tcPr>
           <w:p>
             <w:r>
               <w:rPr>
-                <w:sz w:val="20"/>
+                <w:sz w:val="19"/>
               </w:rPr>
               <w:t>L2</w:t>
             </w:r>
@@ -1858,12 +1918,13 @@
         </w:tc>
         <w:tc>
           <w:tcPr>
-            <w:tcW w:type="dxa" w:w="2196"/>
+            <w:tcW w:w="2627" w:type="dxa"/>
+            <w:shd w:val="clear" w:color="auto" w:fill="F0F5FB"/>
           </w:tcPr>
           <w:p>
             <w:r>
               <w:rPr>
-                <w:sz w:val="20"/>
+                <w:sz w:val="19"/>
               </w:rPr>
               <w:t>Cargo de Lucas Medeiros</w:t>
             </w:r>
@@ -1871,12 +1932,13 @@
         </w:tc>
         <w:tc>
           <w:tcPr>
-            <w:tcW w:type="dxa" w:w="2196"/>
+            <w:tcW w:w="2627" w:type="dxa"/>
+            <w:shd w:val="clear" w:color="auto" w:fill="F0F5FB"/>
           </w:tcPr>
           <w:p>
             <w:r>
               <w:rPr>
-                <w:sz w:val="20"/>
+                <w:sz w:val="19"/>
               </w:rPr>
               <w:t>NÃO INFORMADO</w:t>
             </w:r>
@@ -1884,12 +1946,13 @@
         </w:tc>
         <w:tc>
           <w:tcPr>
-            <w:tcW w:type="dxa" w:w="2196"/>
+            <w:tcW w:w="2627" w:type="dxa"/>
+            <w:shd w:val="clear" w:color="auto" w:fill="F0F5FB"/>
           </w:tcPr>
           <w:p>
             <w:r>
               <w:rPr>
-                <w:sz w:val="20"/>
+                <w:sz w:val="19"/>
               </w:rPr>
               <w:t>Qual o cargo e área específica de Lucas Medeiros?</w:t>
             </w:r>
@@ -1899,12 +1962,12 @@
       <w:tr>
         <w:tc>
           <w:tcPr>
-            <w:tcW w:type="dxa" w:w="2196"/>
+            <w:tcW w:w="1020" w:type="dxa"/>
           </w:tcPr>
           <w:p>
             <w:r>
               <w:rPr>
-                <w:sz w:val="20"/>
+                <w:sz w:val="19"/>
               </w:rPr>
               <w:t>L3</w:t>
             </w:r>
@@ -1912,12 +1975,12 @@
         </w:tc>
         <w:tc>
           <w:tcPr>
-            <w:tcW w:type="dxa" w:w="2196"/>
+            <w:tcW w:w="2627" w:type="dxa"/>
           </w:tcPr>
           <w:p>
             <w:r>
               <w:rPr>
-                <w:sz w:val="20"/>
+                <w:sz w:val="19"/>
               </w:rPr>
               <w:t>Volume de boletos</w:t>
             </w:r>
@@ -1925,12 +1988,12 @@
         </w:tc>
         <w:tc>
           <w:tcPr>
-            <w:tcW w:type="dxa" w:w="2196"/>
+            <w:tcW w:w="2627" w:type="dxa"/>
           </w:tcPr>
           <w:p>
             <w:r>
               <w:rPr>
-                <w:sz w:val="20"/>
+                <w:sz w:val="19"/>
               </w:rPr>
               <w:t>NÃO INFORMADO</w:t>
             </w:r>
@@ -1938,12 +2001,12 @@
         </w:tc>
         <w:tc>
           <w:tcPr>
-            <w:tcW w:type="dxa" w:w="2196"/>
+            <w:tcW w:w="2627" w:type="dxa"/>
           </w:tcPr>
           <w:p>
             <w:r>
               <w:rPr>
-                <w:sz w:val="20"/>
+                <w:sz w:val="19"/>
               </w:rPr>
               <w:t>Quantos boletos são processados por mês na VAB CP? Quais tipos (fornecedores, tributos, outros)?</w:t>
             </w:r>
@@ -1953,12 +2016,13 @@
       <w:tr>
         <w:tc>
           <w:tcPr>
-            <w:tcW w:type="dxa" w:w="2196"/>
+            <w:tcW w:w="1020" w:type="dxa"/>
+            <w:shd w:val="clear" w:color="auto" w:fill="F0F5FB"/>
           </w:tcPr>
           <w:p>
             <w:r>
               <w:rPr>
-                <w:sz w:val="20"/>
+                <w:sz w:val="19"/>
               </w:rPr>
               <w:t>L4</w:t>
             </w:r>
@@ -1966,12 +2030,13 @@
         </w:tc>
         <w:tc>
           <w:tcPr>
-            <w:tcW w:type="dxa" w:w="2196"/>
+            <w:tcW w:w="2627" w:type="dxa"/>
+            <w:shd w:val="clear" w:color="auto" w:fill="F0F5FB"/>
           </w:tcPr>
           <w:p>
             <w:r>
               <w:rPr>
-                <w:sz w:val="20"/>
+                <w:sz w:val="19"/>
               </w:rPr>
               <w:t>Processo atual documentado</w:t>
             </w:r>
@@ -1979,12 +2044,13 @@
         </w:tc>
         <w:tc>
           <w:tcPr>
-            <w:tcW w:type="dxa" w:w="2196"/>
+            <w:tcW w:w="2627" w:type="dxa"/>
+            <w:shd w:val="clear" w:color="auto" w:fill="F0F5FB"/>
           </w:tcPr>
           <w:p>
             <w:r>
               <w:rPr>
-                <w:sz w:val="20"/>
+                <w:sz w:val="19"/>
               </w:rPr>
               <w:t>NÃO — declarado no ticket</w:t>
             </w:r>
@@ -1992,12 +2058,13 @@
         </w:tc>
         <w:tc>
           <w:tcPr>
-            <w:tcW w:type="dxa" w:w="2196"/>
+            <w:tcW w:w="2627" w:type="dxa"/>
+            <w:shd w:val="clear" w:color="auto" w:fill="F0F5FB"/>
           </w:tcPr>
           <w:p>
             <w:r>
               <w:rPr>
-                <w:sz w:val="20"/>
+                <w:sz w:val="19"/>
               </w:rPr>
               <w:t>Existe alguma documentação do fluxo atual, mesmo que informal?</w:t>
             </w:r>
@@ -2007,12 +2074,12 @@
       <w:tr>
         <w:tc>
           <w:tcPr>
-            <w:tcW w:type="dxa" w:w="2196"/>
+            <w:tcW w:w="1020" w:type="dxa"/>
           </w:tcPr>
           <w:p>
             <w:r>
               <w:rPr>
-                <w:sz w:val="20"/>
+                <w:sz w:val="19"/>
               </w:rPr>
               <w:t>L5</w:t>
             </w:r>
@@ -2020,12 +2087,12 @@
         </w:tc>
         <w:tc>
           <w:tcPr>
-            <w:tcW w:type="dxa" w:w="2196"/>
+            <w:tcW w:w="2627" w:type="dxa"/>
           </w:tcPr>
           <w:p>
             <w:r>
               <w:rPr>
-                <w:sz w:val="20"/>
+                <w:sz w:val="19"/>
               </w:rPr>
               <w:t>Habilitação DDA no Santander</w:t>
             </w:r>
@@ -2033,12 +2100,12 @@
         </w:tc>
         <w:tc>
           <w:tcPr>
-            <w:tcW w:type="dxa" w:w="2196"/>
+            <w:tcW w:w="2627" w:type="dxa"/>
           </w:tcPr>
           <w:p>
             <w:r>
               <w:rPr>
-                <w:sz w:val="20"/>
+                <w:sz w:val="19"/>
               </w:rPr>
               <w:t>NÃO INFORMADO</w:t>
             </w:r>
@@ -2046,12 +2113,12 @@
         </w:tc>
         <w:tc>
           <w:tcPr>
-            <w:tcW w:type="dxa" w:w="2196"/>
+            <w:tcW w:w="2627" w:type="dxa"/>
           </w:tcPr>
           <w:p>
             <w:r>
               <w:rPr>
-                <w:sz w:val="20"/>
+                <w:sz w:val="19"/>
               </w:rPr>
               <w:t>A conta Santander da VAB Matriz já está cadastrada para receber DDA eletronicamente?</w:t>
             </w:r>
@@ -2061,12 +2128,13 @@
       <w:tr>
         <w:tc>
           <w:tcPr>
-            <w:tcW w:type="dxa" w:w="2196"/>
+            <w:tcW w:w="1020" w:type="dxa"/>
+            <w:shd w:val="clear" w:color="auto" w:fill="F0F5FB"/>
           </w:tcPr>
           <w:p>
             <w:r>
               <w:rPr>
-                <w:sz w:val="20"/>
+                <w:sz w:val="19"/>
               </w:rPr>
               <w:t>L6</w:t>
             </w:r>
@@ -2074,12 +2142,13 @@
         </w:tc>
         <w:tc>
           <w:tcPr>
-            <w:tcW w:type="dxa" w:w="2196"/>
+            <w:tcW w:w="2627" w:type="dxa"/>
+            <w:shd w:val="clear" w:color="auto" w:fill="F0F5FB"/>
           </w:tcPr>
           <w:p>
             <w:r>
               <w:rPr>
-                <w:sz w:val="20"/>
+                <w:sz w:val="19"/>
               </w:rPr>
               <w:t>Documentação técnica da Div. Logística</w:t>
             </w:r>
@@ -2087,12 +2156,13 @@
         </w:tc>
         <w:tc>
           <w:tcPr>
-            <w:tcW w:type="dxa" w:w="2196"/>
+            <w:tcW w:w="2627" w:type="dxa"/>
+            <w:shd w:val="clear" w:color="auto" w:fill="F0F5FB"/>
           </w:tcPr>
           <w:p>
             <w:r>
               <w:rPr>
-                <w:sz w:val="20"/>
+                <w:sz w:val="19"/>
               </w:rPr>
               <w:t>NÃO INFORMADO</w:t>
             </w:r>
@@ -2100,12 +2170,13 @@
         </w:tc>
         <w:tc>
           <w:tcPr>
-            <w:tcW w:type="dxa" w:w="2196"/>
+            <w:tcW w:w="2627" w:type="dxa"/>
+            <w:shd w:val="clear" w:color="auto" w:fill="F0F5FB"/>
           </w:tcPr>
           <w:p>
             <w:r>
               <w:rPr>
-                <w:sz w:val="20"/>
+                <w:sz w:val="19"/>
               </w:rPr>
               <w:t>Existe documentação da implementação do DDA na Divisão Logística (config SAP, layout CNAB)?</w:t>
             </w:r>
@@ -2115,12 +2186,12 @@
       <w:tr>
         <w:tc>
           <w:tcPr>
-            <w:tcW w:type="dxa" w:w="2196"/>
+            <w:tcW w:w="1020" w:type="dxa"/>
           </w:tcPr>
           <w:p>
             <w:r>
               <w:rPr>
-                <w:sz w:val="20"/>
+                <w:sz w:val="19"/>
               </w:rPr>
               <w:t>L7</w:t>
             </w:r>
@@ -2128,12 +2199,12 @@
         </w:tc>
         <w:tc>
           <w:tcPr>
-            <w:tcW w:type="dxa" w:w="2196"/>
+            <w:tcW w:w="2627" w:type="dxa"/>
           </w:tcPr>
           <w:p>
             <w:r>
               <w:rPr>
-                <w:sz w:val="20"/>
+                <w:sz w:val="19"/>
               </w:rPr>
               <w:t>"Ajustes necessários"</w:t>
             </w:r>
@@ -2141,12 +2212,12 @@
         </w:tc>
         <w:tc>
           <w:tcPr>
-            <w:tcW w:type="dxa" w:w="2196"/>
+            <w:tcW w:w="2627" w:type="dxa"/>
           </w:tcPr>
           <w:p>
             <w:r>
               <w:rPr>
-                <w:sz w:val="20"/>
+                <w:sz w:val="19"/>
               </w:rPr>
               <w:t>NÃO ESPECIFICADO</w:t>
             </w:r>
@@ -2154,12 +2225,12 @@
         </w:tc>
         <w:tc>
           <w:tcPr>
-            <w:tcW w:type="dxa" w:w="2196"/>
+            <w:tcW w:w="2627" w:type="dxa"/>
           </w:tcPr>
           <w:p>
             <w:r>
               <w:rPr>
-                <w:sz w:val="20"/>
+                <w:sz w:val="19"/>
               </w:rPr>
               <w:t>Quais são os ajustes específicos para o CP da VAB em relação ao modelo da Div. Logística?</w:t>
             </w:r>
@@ -2169,12 +2240,13 @@
       <w:tr>
         <w:tc>
           <w:tcPr>
-            <w:tcW w:type="dxa" w:w="2196"/>
+            <w:tcW w:w="1020" w:type="dxa"/>
+            <w:shd w:val="clear" w:color="auto" w:fill="F0F5FB"/>
           </w:tcPr>
           <w:p>
             <w:r>
               <w:rPr>
-                <w:sz w:val="20"/>
+                <w:sz w:val="19"/>
               </w:rPr>
               <w:t>L8</w:t>
             </w:r>
@@ -2182,12 +2254,13 @@
         </w:tc>
         <w:tc>
           <w:tcPr>
-            <w:tcW w:type="dxa" w:w="2196"/>
+            <w:tcW w:w="2627" w:type="dxa"/>
+            <w:shd w:val="clear" w:color="auto" w:fill="F0F5FB"/>
           </w:tcPr>
           <w:p>
             <w:r>
               <w:rPr>
-                <w:sz w:val="20"/>
+                <w:sz w:val="19"/>
               </w:rPr>
               <w:t>Investimento aprovado formalmente</w:t>
             </w:r>
@@ -2195,12 +2268,13 @@
         </w:tc>
         <w:tc>
           <w:tcPr>
-            <w:tcW w:type="dxa" w:w="2196"/>
+            <w:tcW w:w="2627" w:type="dxa"/>
+            <w:shd w:val="clear" w:color="auto" w:fill="F0F5FB"/>
           </w:tcPr>
           <w:p>
             <w:r>
               <w:rPr>
-                <w:sz w:val="20"/>
+                <w:sz w:val="19"/>
               </w:rPr>
               <w:t>NÃO</w:t>
             </w:r>
@@ -2208,12 +2282,13 @@
         </w:tc>
         <w:tc>
           <w:tcPr>
-            <w:tcW w:type="dxa" w:w="2196"/>
+            <w:tcW w:w="2627" w:type="dxa"/>
+            <w:shd w:val="clear" w:color="auto" w:fill="F0F5FB"/>
           </w:tcPr>
           <w:p>
             <w:r>
               <w:rPr>
-                <w:sz w:val="20"/>
+                <w:sz w:val="19"/>
               </w:rPr>
               <w:t>Apesar da aprovação de Gladston, o orçamento foi formalizado financeiramente?</w:t>
             </w:r>
@@ -2223,12 +2298,12 @@
       <w:tr>
         <w:tc>
           <w:tcPr>
-            <w:tcW w:type="dxa" w:w="2196"/>
+            <w:tcW w:w="1020" w:type="dxa"/>
           </w:tcPr>
           <w:p>
             <w:r>
               <w:rPr>
-                <w:sz w:val="20"/>
+                <w:sz w:val="19"/>
               </w:rPr>
               <w:t>L9</w:t>
             </w:r>
@@ -2236,12 +2311,12 @@
         </w:tc>
         <w:tc>
           <w:tcPr>
-            <w:tcW w:type="dxa" w:w="2196"/>
+            <w:tcW w:w="2627" w:type="dxa"/>
           </w:tcPr>
           <w:p>
             <w:r>
               <w:rPr>
-                <w:sz w:val="20"/>
+                <w:sz w:val="19"/>
               </w:rPr>
               <w:t>Programa "Controladoria do Futuro"</w:t>
             </w:r>
@@ -2249,12 +2324,12 @@
         </w:tc>
         <w:tc>
           <w:tcPr>
-            <w:tcW w:type="dxa" w:w="2196"/>
+            <w:tcW w:w="2627" w:type="dxa"/>
           </w:tcPr>
           <w:p>
             <w:r>
               <w:rPr>
-                <w:sz w:val="20"/>
+                <w:sz w:val="19"/>
               </w:rPr>
               <w:t>NÃO CONFIRMADO</w:t>
             </w:r>
@@ -2262,12 +2337,12 @@
         </w:tc>
         <w:tc>
           <w:tcPr>
-            <w:tcW w:type="dxa" w:w="2196"/>
+            <w:tcW w:w="2627" w:type="dxa"/>
           </w:tcPr>
           <w:p>
             <w:r>
               <w:rPr>
-                <w:sz w:val="20"/>
+                <w:sz w:val="19"/>
               </w:rPr>
               <w:t>O DDA faz parte de um programa estratégico maior? Há outras iniciativas relacionadas?</w:t>
             </w:r>
@@ -2277,12 +2352,13 @@
       <w:tr>
         <w:tc>
           <w:tcPr>
-            <w:tcW w:type="dxa" w:w="2196"/>
+            <w:tcW w:w="1020" w:type="dxa"/>
+            <w:shd w:val="clear" w:color="auto" w:fill="F0F5FB"/>
           </w:tcPr>
           <w:p>
             <w:r>
               <w:rPr>
-                <w:sz w:val="20"/>
+                <w:sz w:val="19"/>
               </w:rPr>
               <w:t>L10</w:t>
             </w:r>
@@ -2290,12 +2366,13 @@
         </w:tc>
         <w:tc>
           <w:tcPr>
-            <w:tcW w:type="dxa" w:w="2196"/>
+            <w:tcW w:w="2627" w:type="dxa"/>
+            <w:shd w:val="clear" w:color="auto" w:fill="F0F5FB"/>
           </w:tcPr>
           <w:p>
             <w:r>
               <w:rPr>
-                <w:sz w:val="20"/>
+                <w:sz w:val="19"/>
               </w:rPr>
               <w:t>Responsável técnico no DTI</w:t>
             </w:r>
@@ -2303,12 +2380,13 @@
         </w:tc>
         <w:tc>
           <w:tcPr>
-            <w:tcW w:type="dxa" w:w="2196"/>
+            <w:tcW w:w="2627" w:type="dxa"/>
+            <w:shd w:val="clear" w:color="auto" w:fill="F0F5FB"/>
           </w:tcPr>
           <w:p>
             <w:r>
               <w:rPr>
-                <w:sz w:val="20"/>
+                <w:sz w:val="19"/>
               </w:rPr>
               <w:t>NÃO ATRIBUÍDO</w:t>
             </w:r>
@@ -2316,12 +2394,13 @@
         </w:tc>
         <w:tc>
           <w:tcPr>
-            <w:tcW w:type="dxa" w:w="2196"/>
+            <w:tcW w:w="2627" w:type="dxa"/>
+            <w:shd w:val="clear" w:color="auto" w:fill="F0F5FB"/>
           </w:tcPr>
           <w:p>
             <w:r>
               <w:rPr>
-                <w:sz w:val="20"/>
+                <w:sz w:val="19"/>
               </w:rPr>
               <w:t>Gladston designou alguém do Projetos DTI para esta demanda?</w:t>
             </w:r>
@@ -2331,9 +2410,11 @@
     </w:tbl>
     <w:p/>
     <w:p>
-      <w:r>
-        <w:t>────────────────────────────────────────────────────────────</w:t>
-      </w:r>
+      <w:pPr>
+        <w:pBdr>
+          <w:bottom w:val="single" w:sz="6" w:space="1" w:color="CCCCCC"/>
+        </w:pBdr>
+      </w:pPr>
     </w:p>
     <w:p/>
     <w:p>
@@ -2342,8 +2423,11 @@
       </w:pPr>
       <w:r>
         <w:rPr>
-          <w:color w:val="2E74B5"/>
-          <w:sz w:val="28"/>
+          <w:rFonts w:ascii="Calibri" w:hAnsi="Calibri"/>
+          <w:b/>
+          <w:i w:val="0"/>
+          <w:color w:val="1E5296"/>
+          <w:sz w:val="25"/>
         </w:rPr>
         <w:t>Resumo para Confirmação</w:t>
       </w:r>
@@ -2397,7 +2481,7 @@
     <w:p/>
     <w:sectPr>
       <w:pgSz w:w="12240" w:h="15840"/>
-      <w:pgMar w:top="1440" w:right="1728" w:bottom="1440" w:left="1728" w:header="720" w:footer="720" w:gutter="0"/>
+      <w:pgMar w:top="1417" w:right="1417" w:bottom="1417" w:left="1587" w:header="720" w:footer="720" w:gutter="0"/>
       <w:cols w:space="720"/>
       <w:docGrid w:linePitch="360"/>
     </w:sectPr>
@@ -2770,7 +2854,7 @@
     <w:rsid w:val="00FC693F"/>
     <w:rPr>
       <w:rFonts w:ascii="Calibri" w:hAnsi="Calibri"/>
-      <w:sz w:val="22"/>
+      <w:sz w:val="21"/>
     </w:rPr>
   </w:style>
   <w:style w:type="paragraph" w:styleId="Header">

</xml_diff>